<commit_message>
feat(saff-study): publish specification and test suite v1.5
</commit_message>
<xml_diff>
--- a/output/docx/ExtracaoViaInterfaceMetrix.docx
+++ b/output/docx/ExtracaoViaInterfaceMetrix.docx
@@ -271,7 +271,7 @@
               <w:rPr>
                 <w:sz w:val="18"/>
               </w:rPr>
-              <w:t>SYSTEM verifica se existem diretórios de serial number no formato correto e que foram criados a X ou mais tempo definido na propriedade AUTO_COLLECT_WAIT_TIME no arquivo conf.properties e então: envia as extracoes com essas restricoes para o servidor, transfere essas extrações(somente a pasta de serial number) para a pasta 'AUTO_COLLECT_READ_DIR/PRODUCTNUMBER'(onde o PRODUCTNUMBER é referente a cada SERIALNUMBER), atualiza o contador de extrações realizadas/enviadas e fica em espera por novas extracoes com essas mesmas restricoes na pasta indicada, verifica se existe conexão com o servidor para enviar as extrações offline</w:t>
+              <w:t>SYSTEM verifica se existem diretórios de serial number no formato correto e que foram criados a X ou mais tempo definido na propriedade AUTO_COLLECT_WAIT_TIME no arquivo conf.properties e então: envia as extracoes com essas restricoes para o servidor, transfere essas extrações(somente a pasta de serial number) para a pasta 'AUTO_COLLECT_READ_DIR/PRODUCTNUMBER'(onde o PRODUCTNUMBER é referente a cada SERIALNUMBER), atualiza o contador de extrações realizadas/enviadas e fica em espera por novas extracoes com essas mesmas restricoes na pasta indicada</w:t>
             </w:r>
           </w:p>
         </w:tc>
@@ -324,7 +324,7 @@
           <w:sz w:val="24"/>
           <w:color w:val="2B6CB0"/>
         </w:rPr>
-        <w:t>[TC2] Alternative Flow 1: Altera a pasta C:\\Collect para uma pasta vazia</w:t>
+        <w:t>[TC2] Alternative Flow 1: Altera a pasta C\:\\Collect para uma pasta vazia</w:t>
       </w:r>
     </w:p>
     <w:p>
@@ -557,7 +557,7 @@
               <w:rPr>
                 <w:sz w:val="18"/>
               </w:rPr>
-              <w:t>SYSTEM verifica se existem diretórios de serial number no formato correto e que foram criados a X ou mais tempo definido na propriedade AUTO_COLLECT_WAIT_TIME no arquivo conf.properties e então: envia as extracoes com essas restricoes para o servidor, transfere essas extrações(somente a pasta de serial number) para a pasta 'AUTO_COLLECT_READ_DIR/PRODUCTNUMBER'(onde o PRODUCTNUMBER é referente a cada SERIALNUMBER), atualiza o contador de extrações realizadas/enviadas e fica em espera por novas extracoes com essas mesmas restricoes na pasta indicada, verifica se existe conexão com o servidor para enviar as extrações offline</w:t>
+              <w:t>SYSTEM verifica se existem diretórios de serial number no formato correto e que foram criados a X ou mais tempo definido na propriedade AUTO_COLLECT_WAIT_TIME no arquivo conf.properties e então: envia as extracoes com essas restricoes para o servidor, transfere essas extrações(somente a pasta de serial number) para a pasta 'AUTO_COLLECT_READ_DIR/PRODUCTNUMBER'(onde o PRODUCTNUMBER é referente a cada SERIALNUMBER), atualiza o contador de extrações realizadas/enviadas e fica em espera por novas extracoes com essas mesmas restricoes na pasta indicada</w:t>
             </w:r>
           </w:p>
         </w:tc>
@@ -811,7 +811,7 @@
               <w:rPr>
                 <w:sz w:val="18"/>
               </w:rPr>
-              <w:t>SYSTEM verifica se existem diretórios de serial number no formato correto e que foram criados a X ou mais tempo definido na propriedade AUTO_COLLECT_WAIT_TIME no arquivo conf.properties e então: envia as extracoes com essas restricoes para o servidor, transfere essas extrações(somente a pasta de serial number) para a pasta 'AUTO_COLLECT_READ_DIR/PRODUCTNUMBER'(onde o PRODUCTNUMBER é referente a cada SERIALNUMBER), atualiza o contador de extrações realizadas/enviadas e fica em espera por novas extracoes com essas mesmas restricoes na pasta indicada, verifica se existe conexão com o servidor para enviar as extrações offline</w:t>
+              <w:t>SYSTEM verifica se existem diretórios de serial number no formato correto e que foram criados a X ou mais tempo definido na propriedade AUTO_COLLECT_WAIT_TIME no arquivo conf.properties e então: envia as extracoes com essas restricoes para o servidor, transfere essas extrações(somente a pasta de serial number) para a pasta 'AUTO_COLLECT_READ_DIR/PRODUCTNUMBER'(onde o PRODUCTNUMBER é referente a cada SERIALNUMBER), atualiza o contador de extrações realizadas/enviadas e fica em espera por novas extracoes com essas mesmas restricoes na pasta indicada</w:t>
             </w:r>
           </w:p>
         </w:tc>
@@ -875,7 +875,7 @@
               <w:rPr>
                 <w:sz w:val="18"/>
               </w:rPr>
-              <w:t>SYSTEM verifica se existem diretórios de serial number no formato correto e que foram criados a X ou mais tempo definido na propriedade AUTO_COLLECT_WAIT_TIME no arquivo conf.properties e então: envia as extracoes com essas restricoes para o servidor, transfere essas extrações(somente a pasta de serial number) para a pasta 'AUTO_COLLECT_READ_DIR/PRODUCTNUMBER'(onde o PRODUCTNUMBER é referente a cada SERIALNUMBER), atualiza o contador de extrações realizadas/enviadas e fica em espera por novas extracoes com essas mesmas restricoes na pasta indicada, verifica se existe conexão com o servidor para enviar as extrações offline</w:t>
+              <w:t>SYSTEM verifica se existem diretórios de serial number no formato correto e que foram criados a X ou mais tempo definido na propriedade AUTO_COLLECT_WAIT_TIME no arquivo conf.properties e então: envia as extracoes com essas restricoes para o servidor, transfere essas extrações(somente a pasta de serial number) para a pasta 'AUTO_COLLECT_READ_DIR/PRODUCTNUMBER'(onde o PRODUCTNUMBER é referente a cada SERIALNUMBER), atualiza o contador de extrações realizadas/enviadas e fica em espera por novas extracoes com essas mesmas restricoes na pasta indicada</w:t>
             </w:r>
           </w:p>
         </w:tc>
@@ -1097,7 +1097,7 @@
               <w:rPr>
                 <w:sz w:val="18"/>
               </w:rPr>
-              <w:t>SYSTEM verifica se existem diretórios de serial number no formato correto e que foram criados a X ou mais tempo definido na propriedade AUTO_COLLECT_WAIT_TIME no arquivo conf.properties e então: envia as extracoes com essas restricoes para o servidor, transfere essas extrações(somente a pasta de serial number) para a pasta 'AUTO_COLLECT_READ_DIR/PRODUCTNUMBER'(onde o PRODUCTNUMBER é referente a cada SERIALNUMBER), atualiza o contador de extrações realizadas/enviadas e fica em espera por novas extracoes com essas mesmas restricoes na pasta indicada, verifica se existe conexão com o servidor para enviar as extrações offline</w:t>
+              <w:t>SYSTEM verifica se existem diretórios de serial number no formato correto e que foram criados a X ou mais tempo definido na propriedade AUTO_COLLECT_WAIT_TIME no arquivo conf.properties e então: envia as extracoes com essas restricoes para o servidor, transfere essas extrações(somente a pasta de serial number) para a pasta 'AUTO_COLLECT_READ_DIR/PRODUCTNUMBER'(onde o PRODUCTNUMBER é referente a cada SERIALNUMBER), atualiza o contador de extrações realizadas/enviadas e fica em espera por novas extracoes com essas mesmas restricoes na pasta indicada</w:t>
             </w:r>
           </w:p>
         </w:tc>

</xml_diff>

<commit_message>
feat(saff-study): publish specification and test suite v2.3
</commit_message>
<xml_diff>
--- a/output/docx/ExtracaoViaInterfaceMetrix.docx
+++ b/output/docx/ExtracaoViaInterfaceMetrix.docx
@@ -1172,228 +1172,6 @@
         <w:br/>
       </w:r>
     </w:p>
-    <w:p>
-      <w:pPr>
-        <w:spacing w:before="180" w:after="60"/>
-      </w:pPr>
-      <w:r>
-        <w:rPr>
-          <w:b w:val="on"/>
-          <w:sz w:val="24"/>
-          <w:color w:val="2B6CB0"/>
-        </w:rPr>
-        <w:t>[TC5] Exception Flow 2: Extração não se encontra em formato adequado</w:t>
-      </w:r>
-    </w:p>
-    <w:p>
-      <w:pPr>
-        <w:spacing w:after="40"/>
-      </w:pPr>
-      <w:r>
-        <w:rPr>
-          <w:b w:val="on"/>
-          <w:sz w:val="20"/>
-        </w:rPr>
-        <w:t xml:space="preserve">Preconditions: </w:t>
-      </w:r>
-      <w:r>
-        <w:rPr>
-          <w:sz w:val="20"/>
-        </w:rPr>
-        <w:t xml:space="preserve"> </w:t>
-      </w:r>
-    </w:p>
-    <w:p>
-      <w:pPr>
-        <w:spacing w:after="40"/>
-      </w:pPr>
-      <w:r>
-        <w:rPr>
-          <w:b w:val="on"/>
-          <w:sz w:val="20"/>
-        </w:rPr>
-        <w:t xml:space="preserve">Postconditions: </w:t>
-      </w:r>
-      <w:r>
-        <w:rPr>
-          <w:sz w:val="20"/>
-        </w:rPr>
-        <w:t>Flow interrupted due to exception / error</w:t>
-      </w:r>
-    </w:p>
-    <w:tbl>
-      <w:tblPr>
-        <w:tblW w:w="5000" w:type="pct"/>
-        <w:tblBorders>
-          <w:top w:val="single"/>
-          <w:left w:val="single"/>
-          <w:bottom w:val="single"/>
-          <w:right w:val="single"/>
-          <w:insideH w:val="single"/>
-          <w:insideV w:val="single"/>
-        </w:tblBorders>
-      </w:tblPr>
-      <w:tr>
-        <w:tc>
-          <w:tcPr>
-            <w:tcW w:w="1200" w:type="dxa"/>
-            <w:shd w:color="auto" w:val="clear" w:fill="2B6CB0"/>
-          </w:tcPr>
-          <w:p>
-            <w:pPr>
-              <w:jc w:val="left"/>
-            </w:pPr>
-            <w:r>
-              <w:rPr>
-                <w:b w:val="on"/>
-                <w:sz w:val="20"/>
-                <w:color w:val="FFFFFF"/>
-              </w:rPr>
-              <w:t>Step #</w:t>
-            </w:r>
-          </w:p>
-        </w:tc>
-        <w:tc>
-          <w:tcPr>
-            <w:tcW w:w="4500" w:type="dxa"/>
-            <w:shd w:color="auto" w:val="clear" w:fill="2B6CB0"/>
-          </w:tcPr>
-          <w:p>
-            <w:pPr>
-              <w:jc w:val="left"/>
-            </w:pPr>
-            <w:r>
-              <w:rPr>
-                <w:b w:val="on"/>
-                <w:sz w:val="20"/>
-                <w:color w:val="FFFFFF"/>
-              </w:rPr>
-              <w:t>Actor Action</w:t>
-            </w:r>
-          </w:p>
-        </w:tc>
-        <w:tc>
-          <w:tcPr>
-            <w:tcW w:w="4500" w:type="dxa"/>
-            <w:shd w:color="auto" w:val="clear" w:fill="2B6CB0"/>
-          </w:tcPr>
-          <w:p>
-            <w:pPr>
-              <w:jc w:val="left"/>
-            </w:pPr>
-            <w:r>
-              <w:rPr>
-                <w:b w:val="on"/>
-                <w:sz w:val="20"/>
-                <w:color w:val="FFFFFF"/>
-              </w:rPr>
-              <w:t>Expected Result (System)</w:t>
-            </w:r>
-          </w:p>
-        </w:tc>
-      </w:tr>
-      <w:tr>
-        <w:tc>
-          <w:p>
-            <w:r>
-              <w:rPr>
-                <w:sz w:val="18"/>
-              </w:rPr>
-              <w:t>1</w:t>
-            </w:r>
-          </w:p>
-        </w:tc>
-        <w:tc>
-          <w:p>
-            <w:r>
-              <w:rPr>
-                <w:sz w:val="18"/>
-              </w:rPr>
-              <w:t>operador: inicia o SAFF Extractor e se autentica</w:t>
-            </w:r>
-          </w:p>
-        </w:tc>
-        <w:tc>
-          <w:p>
-            <w:r>
-              <w:rPr>
-                <w:sz w:val="18"/>
-              </w:rPr>
-              <w:t>SYSTEM exibe tela de coleta automatica</w:t>
-            </w:r>
-          </w:p>
-        </w:tc>
-      </w:tr>
-      <w:tr>
-        <w:tc>
-          <w:p>
-            <w:r>
-              <w:rPr>
-                <w:sz w:val="18"/>
-              </w:rPr>
-              <w:t>2</w:t>
-            </w:r>
-          </w:p>
-        </w:tc>
-        <w:tc>
-          <w:p>
-            <w:r>
-              <w:rPr>
-                <w:sz w:val="18"/>
-              </w:rPr>
-              <w:t>operador: seleciona uma pasta contendo varias extracoes, fornece as informacoes solicitadas na tela inicial e pressiona o botao 'Start'</w:t>
-            </w:r>
-          </w:p>
-        </w:tc>
-        <w:tc>
-          <w:p>
-            <w:r>
-              <w:rPr>
-                <w:sz w:val="18"/>
-              </w:rPr>
-              <w:t>SYSTEM bloqueia todos os botoes, com excecao do botao 'Stop'</w:t>
-            </w:r>
-          </w:p>
-        </w:tc>
-      </w:tr>
-      <w:tr>
-        <w:tc>
-          <w:p>
-            <w:r>
-              <w:rPr>
-                <w:sz w:val="18"/>
-              </w:rPr>
-              <w:t>3</w:t>
-            </w:r>
-          </w:p>
-        </w:tc>
-        <w:tc>
-          <w:p>
-            <w:r>
-              <w:rPr>
-                <w:sz w:val="18"/>
-              </w:rPr>
-              <w:t>clock: a cada 30 segundos</w:t>
-            </w:r>
-          </w:p>
-        </w:tc>
-        <w:tc>
-          <w:p>
-            <w:r>
-              <w:rPr>
-                <w:sz w:val="18"/>
-              </w:rPr>
-              <w:t>SYSTEM move a extração para a pasta broken</w:t>
-            </w:r>
-          </w:p>
-        </w:tc>
-      </w:tr>
-    </w:tbl>
-    <w:p>
-      <w:r>
-        <w:br/>
-      </w:r>
-    </w:p>
   </w:body>
 </w:document>
 </file>
</xml_diff>

<commit_message>
feat(saff-study): publish specification and test suite v2.5
</commit_message>
<xml_diff>
--- a/output/docx/ExtracaoViaInterfaceMetrix.docx
+++ b/output/docx/ExtracaoViaInterfaceMetrix.docx
@@ -106,7 +106,7 @@
         <w:rPr>
           <w:sz w:val="20"/>
         </w:rPr>
-        <w:t>As extracoes da pasta indicada devem ter sido enviadas para o servidor e transferidas para a pasta 'read'</w:t>
+        <w:t>As extracoes da pasta indicada deve ter sido enviadas para o servidor e transferidas para a pasta 'read'</w:t>
       </w:r>
     </w:p>
     <w:tbl>
@@ -271,7 +271,7 @@
               <w:rPr>
                 <w:sz w:val="18"/>
               </w:rPr>
-              <w:t>SYSTEM bloqueia todos os botoes, com excecao do botao 'Stop'</w:t>
+              <w:t>SYSTEM processes action successfully</w:t>
             </w:r>
           </w:p>
         </w:tc>
@@ -392,7 +392,7 @@
         <w:rPr>
           <w:sz w:val="20"/>
         </w:rPr>
-        <w:t>As extracoes da pasta indicada devem ter sido enviadas para o servidor e transferidas para a pasta 'read'</w:t>
+        <w:t>As extracoes da pasta indicada deve ter sido enviadas para o servidor e transferidas para a pasta 'read'</w:t>
       </w:r>
     </w:p>
     <w:tbl>
@@ -579,17 +579,17 @@
               <w:rPr>
                 <w:sz w:val="18"/>
               </w:rPr>
-              <w:t>administrador: adiciona extracao a pasta indicada</w:t>
-            </w:r>
-          </w:p>
-        </w:tc>
-        <w:tc>
-          <w:p>
-            <w:r>
-              <w:rPr>
-                <w:sz w:val="18"/>
-              </w:rPr>
-              <w:t>SYSTEM bloqueia todos os botoes, com excecao do botao 'Stop'</w:t>
+              <w:t>clock: a cada 30 segundos</w:t>
+            </w:r>
+          </w:p>
+        </w:tc>
+        <w:tc>
+          <w:p>
+            <w:r>
+              <w:rPr>
+                <w:sz w:val="18"/>
+              </w:rPr>
+              <w:t>SYSTEM envia extracoes para o servidor, transfere essas extrações para a pasta 'read', atualiza o contador de extrações realizadas e fica em espera por novas extracoes na pasta indicada</w:t>
             </w:r>
           </w:p>
         </w:tc>
@@ -602,38 +602,6 @@
                 <w:sz w:val="18"/>
               </w:rPr>
               <w:t>5</w:t>
-            </w:r>
-          </w:p>
-        </w:tc>
-        <w:tc>
-          <w:p>
-            <w:r>
-              <w:rPr>
-                <w:sz w:val="18"/>
-              </w:rPr>
-              <w:t>clock: a cada 30 segundos</w:t>
-            </w:r>
-          </w:p>
-        </w:tc>
-        <w:tc>
-          <w:p>
-            <w:r>
-              <w:rPr>
-                <w:sz w:val="18"/>
-              </w:rPr>
-              <w:t>SYSTEM envia extracoes para o servidor, transfere essas extrações para a pasta 'read', atualiza o contador de extrações realizadas e fica em espera por novas extracoes na pasta indicada</w:t>
-            </w:r>
-          </w:p>
-        </w:tc>
-      </w:tr>
-      <w:tr>
-        <w:tc>
-          <w:p>
-            <w:r>
-              <w:rPr>
-                <w:sz w:val="18"/>
-              </w:rPr>
-              <w:t>6</w:t>
             </w:r>
           </w:p>
         </w:tc>
@@ -710,7 +678,7 @@
         <w:rPr>
           <w:sz w:val="20"/>
         </w:rPr>
-        <w:t>As extracoes da pasta indicada devem ter sido enviadas para o servidor e transferidas para a pasta 'read'</w:t>
+        <w:t>As extracoes da pasta indicada deve ter sido enviadas para o servidor e transferidas para a pasta 'read'</w:t>
       </w:r>
     </w:p>
     <w:tbl>
@@ -875,7 +843,7 @@
               <w:rPr>
                 <w:sz w:val="18"/>
               </w:rPr>
-              <w:t>SYSTEM bloqueia todos os botoes, com excecao do botao 'Stop'</w:t>
+              <w:t>SYSTEM processes action successfully</w:t>
             </w:r>
           </w:p>
         </w:tc>
@@ -907,7 +875,7 @@
               <w:rPr>
                 <w:sz w:val="18"/>
               </w:rPr>
-              <w:t>SYSTEM envia extracoes para o servidor, transfere essas extrações para a pasta 'read', atualiza o contador de extrações realizadas e fica em espera por novas extracoes na pasta indicada</w:t>
+              <w:t>SYSTEM processes action successfully</w:t>
             </w:r>
           </w:p>
         </w:tc>
@@ -939,71 +907,7 @@
               <w:rPr>
                 <w:sz w:val="18"/>
               </w:rPr>
-              <w:t>SYSTEM bloqueia todos os botoes, com excecao do botao 'Stop'</w:t>
-            </w:r>
-          </w:p>
-        </w:tc>
-      </w:tr>
-      <w:tr>
-        <w:tc>
-          <w:p>
-            <w:r>
-              <w:rPr>
-                <w:sz w:val="18"/>
-              </w:rPr>
-              <w:t>6</w:t>
-            </w:r>
-          </w:p>
-        </w:tc>
-        <w:tc>
-          <w:p>
-            <w:r>
-              <w:rPr>
-                <w:sz w:val="18"/>
-              </w:rPr>
-              <w:t>clock: a cada 30 segundos</w:t>
-            </w:r>
-          </w:p>
-        </w:tc>
-        <w:tc>
-          <w:p>
-            <w:r>
-              <w:rPr>
-                <w:sz w:val="18"/>
-              </w:rPr>
-              <w:t>SYSTEM envia extracoes para o servidor, transfere essas extrações para a pasta 'read', atualiza o contador de extrações realizadas e fica em espera por novas extracoes na pasta indicada</w:t>
-            </w:r>
-          </w:p>
-        </w:tc>
-      </w:tr>
-      <w:tr>
-        <w:tc>
-          <w:p>
-            <w:r>
-              <w:rPr>
-                <w:sz w:val="18"/>
-              </w:rPr>
-              <w:t>7</w:t>
-            </w:r>
-          </w:p>
-        </w:tc>
-        <w:tc>
-          <w:p>
-            <w:r>
-              <w:rPr>
-                <w:sz w:val="18"/>
-              </w:rPr>
-              <w:t>administrador: pressiona botao 'Stop'</w:t>
-            </w:r>
-          </w:p>
-        </w:tc>
-        <w:tc>
-          <w:p>
-            <w:r>
-              <w:rPr>
-                <w:sz w:val="18"/>
-              </w:rPr>
-              <w:t>SYSTEM desbloqueia todos os botoes e para de escutar a pasta indicada</w:t>
+              <w:t>SYSTEM processes action successfully</w:t>
             </w:r>
           </w:p>
         </w:tc>
@@ -1225,7 +1129,7 @@
               <w:rPr>
                 <w:sz w:val="18"/>
               </w:rPr>
-              <w:t>SYSTEM bloqueia todos os botoes, com excecao do botao 'Stop'</w:t>
+              <w:t>SYSTEM processes action successfully</w:t>
             </w:r>
           </w:p>
         </w:tc>

</xml_diff>